<commit_message>
docs(AOFP-200): add Cursor to AI tools in report 4
</commit_message>
<xml_diff>
--- a/docs/review-2/source/Report4_Software_Design_Document_-Final.docx
+++ b/docs/review-2/source/Report4_Software_Design_Document_-Final.docx
@@ -6467,7 +6467,7 @@
               <w:rPr>
                 <w:sz w:val="19"/>
               </w:rPr>
-              <w:t>Code review, implementation support, test writing, documentation and diagram drafting; every output is reviewed and verified against the code by the team.</w:t>
+              <w:t>Code review, implementation support, test writing, create model 3D, documentation and diagram drafting; every output is reviewed and verified against the code by the team.</w:t>
             </w:r>
           </w:p>
         </w:tc>
@@ -6501,7 +6501,7 @@
               <w:rPr>
                 <w:sz w:val="19"/>
               </w:rPr>
-              <w:t>[Team to add other tools]</w:t>
+              <w:t>Cursor</w:t>
             </w:r>
           </w:p>
         </w:tc>
@@ -6517,7 +6517,7 @@
               <w:rPr>
                 <w:sz w:val="19"/>
               </w:rPr>
-              <w:t>[Describe usage]</w:t>
+              <w:t>Frontend implementation support, documentation and diagram drafting, CI lock file fix, and merge-conflict resolution; every output is reviewed and verified against the code by the team.</w:t>
             </w:r>
           </w:p>
         </w:tc>

</xml_diff>

<commit_message>
docs(AOFP-201): add data sent and rollback to report 4 technology declaration
</commit_message>
<xml_diff>
--- a/docs/review-2/source/Report4_Software_Design_Document_-Final.docx
+++ b/docs/review-2/source/Report4_Software_Design_Document_-Final.docx
@@ -554,7 +554,7 @@
             <w:fldChar w:fldCharType="separate"/>
           </w:r>
           <w:r>
-            <w:t>7</w:t>
+            <w:t>8</w:t>
           </w:r>
           <w:r>
             <w:fldChar w:fldCharType="end"/>
@@ -601,7 +601,7 @@
             <w:fldChar w:fldCharType="separate"/>
           </w:r>
           <w:r>
-            <w:t>9</w:t>
+            <w:t>10</w:t>
           </w:r>
           <w:r>
             <w:fldChar w:fldCharType="end"/>
@@ -648,7 +648,7 @@
             <w:fldChar w:fldCharType="separate"/>
           </w:r>
           <w:r>
-            <w:t>10</w:t>
+            <w:t>11</w:t>
           </w:r>
           <w:r>
             <w:fldChar w:fldCharType="end"/>
@@ -695,7 +695,7 @@
             <w:fldChar w:fldCharType="separate"/>
           </w:r>
           <w:r>
-            <w:t>10</w:t>
+            <w:t>11</w:t>
           </w:r>
           <w:r>
             <w:fldChar w:fldCharType="end"/>
@@ -742,7 +742,7 @@
             <w:fldChar w:fldCharType="separate"/>
           </w:r>
           <w:r>
-            <w:t>11</w:t>
+            <w:t>12</w:t>
           </w:r>
           <w:r>
             <w:fldChar w:fldCharType="end"/>
@@ -789,7 +789,7 @@
             <w:fldChar w:fldCharType="separate"/>
           </w:r>
           <w:r>
-            <w:t>12</w:t>
+            <w:t>13</w:t>
           </w:r>
           <w:r>
             <w:fldChar w:fldCharType="end"/>
@@ -836,7 +836,7 @@
             <w:fldChar w:fldCharType="separate"/>
           </w:r>
           <w:r>
-            <w:t>14</w:t>
+            <w:t>15</w:t>
           </w:r>
           <w:r>
             <w:fldChar w:fldCharType="end"/>
@@ -883,7 +883,7 @@
             <w:fldChar w:fldCharType="separate"/>
           </w:r>
           <w:r>
-            <w:t>15</w:t>
+            <w:t>16</w:t>
           </w:r>
           <w:r>
             <w:fldChar w:fldCharType="end"/>
@@ -930,7 +930,7 @@
             <w:fldChar w:fldCharType="separate"/>
           </w:r>
           <w:r>
-            <w:t>15</w:t>
+            <w:t>16</w:t>
           </w:r>
           <w:r>
             <w:fldChar w:fldCharType="end"/>
@@ -977,7 +977,7 @@
             <w:fldChar w:fldCharType="separate"/>
           </w:r>
           <w:r>
-            <w:t>16</w:t>
+            <w:t>17</w:t>
           </w:r>
           <w:r>
             <w:fldChar w:fldCharType="end"/>
@@ -1024,7 +1024,7 @@
             <w:fldChar w:fldCharType="separate"/>
           </w:r>
           <w:r>
-            <w:t>17</w:t>
+            <w:t>18</w:t>
           </w:r>
           <w:r>
             <w:fldChar w:fldCharType="end"/>
@@ -1071,7 +1071,7 @@
             <w:fldChar w:fldCharType="separate"/>
           </w:r>
           <w:r>
-            <w:t>17</w:t>
+            <w:t>18</w:t>
           </w:r>
           <w:r>
             <w:fldChar w:fldCharType="end"/>
@@ -1118,7 +1118,7 @@
             <w:fldChar w:fldCharType="separate"/>
           </w:r>
           <w:r>
-            <w:t>17</w:t>
+            <w:t>18</w:t>
           </w:r>
           <w:r>
             <w:fldChar w:fldCharType="end"/>
@@ -1165,7 +1165,7 @@
             <w:fldChar w:fldCharType="separate"/>
           </w:r>
           <w:r>
-            <w:t>18</w:t>
+            <w:t>19</w:t>
           </w:r>
           <w:r>
             <w:fldChar w:fldCharType="end"/>
@@ -1212,7 +1212,7 @@
             <w:fldChar w:fldCharType="separate"/>
           </w:r>
           <w:r>
-            <w:t>18</w:t>
+            <w:t>19</w:t>
           </w:r>
           <w:r>
             <w:fldChar w:fldCharType="end"/>
@@ -1259,7 +1259,7 @@
             <w:fldChar w:fldCharType="separate"/>
           </w:r>
           <w:r>
-            <w:t>18</w:t>
+            <w:t>19</w:t>
           </w:r>
           <w:r>
             <w:fldChar w:fldCharType="end"/>
@@ -1306,7 +1306,7 @@
             <w:fldChar w:fldCharType="separate"/>
           </w:r>
           <w:r>
-            <w:t>18</w:t>
+            <w:t>19</w:t>
           </w:r>
           <w:r>
             <w:fldChar w:fldCharType="end"/>
@@ -1353,7 +1353,7 @@
             <w:fldChar w:fldCharType="separate"/>
           </w:r>
           <w:r>
-            <w:t>19</w:t>
+            <w:t>20</w:t>
           </w:r>
           <w:r>
             <w:fldChar w:fldCharType="end"/>
@@ -1400,7 +1400,7 @@
             <w:fldChar w:fldCharType="separate"/>
           </w:r>
           <w:r>
-            <w:t>19</w:t>
+            <w:t>20</w:t>
           </w:r>
           <w:r>
             <w:fldChar w:fldCharType="end"/>
@@ -1447,7 +1447,7 @@
             <w:fldChar w:fldCharType="separate"/>
           </w:r>
           <w:r>
-            <w:t>19</w:t>
+            <w:t>20</w:t>
           </w:r>
           <w:r>
             <w:fldChar w:fldCharType="end"/>
@@ -1494,7 +1494,7 @@
             <w:fldChar w:fldCharType="separate"/>
           </w:r>
           <w:r>
-            <w:t>19</w:t>
+            <w:t>20</w:t>
           </w:r>
           <w:r>
             <w:fldChar w:fldCharType="end"/>
@@ -5108,8 +5108,9 @@
         </w:tblCellMar>
       </w:tblPr>
       <w:tblGrid>
-        <w:gridCol w:w="3447"/>
-        <w:gridCol w:w="6129"/>
+        <w:gridCol w:w="2300"/>
+        <w:gridCol w:w="3300"/>
+        <w:gridCol w:w="3976"/>
       </w:tblGrid>
       <w:tr>
         <w:tblPrEx>
@@ -5133,7 +5134,7 @@
         </w:trPr>
         <w:tc>
           <w:tcPr>
-            <w:tcW w:w="3249" w:type="dxa"/>
+            <w:tcW w:w="2170" w:type="dxa"/>
             <w:shd w:val="clear" w:color="auto" w:fill="FFE8E1"/>
           </w:tcPr>
           <w:p>
@@ -5152,7 +5153,7 @@
         </w:tc>
         <w:tc>
           <w:tcPr>
-            <w:tcW w:w="5776" w:type="dxa"/>
+            <w:tcW w:w="3110" w:type="dxa"/>
             <w:shd w:val="clear" w:color="auto" w:fill="FFE8E1"/>
           </w:tcPr>
           <w:p>
@@ -5166,6 +5167,25 @@
                 <w:sz w:val="19"/>
               </w:rPr>
               <w:t>Purpose in OptiPack AI</w:t>
+            </w:r>
+          </w:p>
+        </w:tc>
+        <w:tc>
+          <w:tcPr>
+            <w:tcW w:w="3745" w:type="dxa"/>
+            <w:shd w:val="clear" w:color="auto" w:fill="FFE8E1"/>
+          </w:tcPr>
+          <w:p>
+            <w:pPr>
+              <w:spacing w:before="0" w:after="0"/>
+              <w:jc w:val="center"/>
+            </w:pPr>
+            <w:r>
+              <w:rPr>
+                <w:b/>
+                <w:sz w:val="19"/>
+              </w:rPr>
+              <w:t xml:space="preserve">Data sent</w:t>
             </w:r>
           </w:p>
         </w:tc>
@@ -5189,7 +5209,7 @@
         </w:tblPrEx>
         <w:tc>
           <w:tcPr>
-            <w:tcW w:w="3249" w:type="dxa"/>
+            <w:tcW w:w="2170" w:type="dxa"/>
           </w:tcPr>
           <w:p>
             <w:pPr>
@@ -5205,7 +5225,7 @@
         </w:tc>
         <w:tc>
           <w:tcPr>
-            <w:tcW w:w="5776" w:type="dxa"/>
+            <w:tcW w:w="3110" w:type="dxa"/>
           </w:tcPr>
           <w:p>
             <w:pPr>
@@ -5216,6 +5236,22 @@
                 <w:sz w:val="19"/>
               </w:rPr>
               <w:t>Shop connection (OAuth) and order / catalog import.</w:t>
+            </w:r>
+          </w:p>
+        </w:tc>
+        <w:tc>
+          <w:tcPr>
+            <w:tcW w:w="3745" w:type="dxa"/>
+          </w:tcPr>
+          <w:p>
+            <w:pPr>
+              <w:spacing w:before="0" w:after="0"/>
+            </w:pPr>
+            <w:r>
+              <w:rPr>
+                <w:sz w:val="19"/>
+              </w:rPr>
+              <w:t xml:space="preserve">App key and HMAC-SHA256 signature, OAuth authorization code and shop access / refresh tokens; read requests with time window, page and order IDs (orders, order items, products). Nothing is written back to Lazada.</w:t>
             </w:r>
           </w:p>
         </w:tc>
@@ -5239,7 +5275,7 @@
         </w:tblPrEx>
         <w:tc>
           <w:tcPr>
-            <w:tcW w:w="3249" w:type="dxa"/>
+            <w:tcW w:w="2170" w:type="dxa"/>
           </w:tcPr>
           <w:p>
             <w:pPr>
@@ -5255,7 +5291,7 @@
         </w:tc>
         <w:tc>
           <w:tcPr>
-            <w:tcW w:w="5776" w:type="dxa"/>
+            <w:tcW w:w="3110" w:type="dxa"/>
           </w:tcPr>
           <w:p>
             <w:pPr>
@@ -5266,6 +5302,22 @@
                 <w:sz w:val="19"/>
               </w:rPr>
               <w:t>Second marketplace: orders, webhooks, returns, status and stock write-back.</w:t>
+            </w:r>
+          </w:p>
+        </w:tc>
+        <w:tc>
+          <w:tcPr>
+            <w:tcW w:w="3745" w:type="dxa"/>
+          </w:tcPr>
+          <w:p>
+            <w:pPr>
+              <w:spacing w:before="0" w:after="0"/>
+            </w:pPr>
+            <w:r>
+              <w:rPr>
+                <w:sz w:val="19"/>
+              </w:rPr>
+              <w:t xml:space="preserve">Signed requests with app key and shop access token: order acknowledgement; order status with tracking code, trip code, carrier and failure reason; return approve / reject decisions and exchange shipment; sellable stock per seller SKU.</w:t>
             </w:r>
           </w:p>
         </w:tc>
@@ -5289,7 +5341,7 @@
         </w:tblPrEx>
         <w:tc>
           <w:tcPr>
-            <w:tcW w:w="3249" w:type="dxa"/>
+            <w:tcW w:w="2170" w:type="dxa"/>
           </w:tcPr>
           <w:p>
             <w:pPr>
@@ -5305,7 +5357,7 @@
         </w:tc>
         <w:tc>
           <w:tcPr>
-            <w:tcW w:w="5776" w:type="dxa"/>
+            <w:tcW w:w="3110" w:type="dxa"/>
           </w:tcPr>
           <w:p>
             <w:pPr>
@@ -5316,6 +5368,22 @@
                 <w:sz w:val="19"/>
               </w:rPr>
               <w:t>Shipping fee quotes, shipping orders, tracking, status webhooks, labels.</w:t>
+            </w:r>
+          </w:p>
+        </w:tc>
+        <w:tc>
+          <w:tcPr>
+            <w:tcW w:w="3745" w:type="dxa"/>
+          </w:tcPr>
+          <w:p>
+            <w:pPr>
+              <w:spacing w:before="0" w:after="0"/>
+            </w:pPr>
+            <w:r>
+              <w:rPr>
+                <w:sz w:val="19"/>
+              </w:rPr>
+              <w:t xml:space="preserve">Shop ID and API token; recipient name, phone and address (province, district, ward); parcel weight and dimensions; item names, codes, quantities and prices; COD amount, insurance value, note and client order code.</w:t>
             </w:r>
           </w:p>
         </w:tc>
@@ -5339,7 +5407,7 @@
         </w:tblPrEx>
         <w:tc>
           <w:tcPr>
-            <w:tcW w:w="3249" w:type="dxa"/>
+            <w:tcW w:w="2170" w:type="dxa"/>
           </w:tcPr>
           <w:p>
             <w:pPr>
@@ -5355,7 +5423,7 @@
         </w:tc>
         <w:tc>
           <w:tcPr>
-            <w:tcW w:w="5776" w:type="dxa"/>
+            <w:tcW w:w="3110" w:type="dxa"/>
           </w:tcPr>
           <w:p>
             <w:pPr>
@@ -5366,6 +5434,22 @@
                 <w:sz w:val="19"/>
               </w:rPr>
               <w:t>Staff login with Google for existing accounts.</w:t>
+            </w:r>
+          </w:p>
+        </w:tc>
+        <w:tc>
+          <w:tcPr>
+            <w:tcW w:w="3745" w:type="dxa"/>
+          </w:tcPr>
+          <w:p>
+            <w:pPr>
+              <w:spacing w:before="0" w:after="0"/>
+            </w:pPr>
+            <w:r>
+              <w:rPr>
+                <w:sz w:val="19"/>
+              </w:rPr>
+              <w:t xml:space="preserve">OAuth client ID / secret, authorization code and PKCE verifier; Google returns the account e-mail and its verified flag.</w:t>
             </w:r>
           </w:p>
         </w:tc>
@@ -5389,7 +5473,7 @@
         </w:tblPrEx>
         <w:tc>
           <w:tcPr>
-            <w:tcW w:w="3249" w:type="dxa"/>
+            <w:tcW w:w="2170" w:type="dxa"/>
           </w:tcPr>
           <w:p>
             <w:pPr>
@@ -5405,7 +5489,7 @@
         </w:tc>
         <w:tc>
           <w:tcPr>
-            <w:tcW w:w="5776" w:type="dxa"/>
+            <w:tcW w:w="3110" w:type="dxa"/>
           </w:tcPr>
           <w:p>
             <w:pPr>
@@ -5416,6 +5500,22 @@
                 <w:sz w:val="19"/>
               </w:rPr>
               <w:t>Account and password e-mails.</w:t>
+            </w:r>
+          </w:p>
+        </w:tc>
+        <w:tc>
+          <w:tcPr>
+            <w:tcW w:w="3745" w:type="dxa"/>
+          </w:tcPr>
+          <w:p>
+            <w:pPr>
+              <w:spacing w:before="0" w:after="0"/>
+            </w:pPr>
+            <w:r>
+              <w:rPr>
+                <w:sz w:val="19"/>
+              </w:rPr>
+              <w:t xml:space="preserve">Recipient e-mail and name with the e-mail content: temporary password (new account), password reset link, account-locked notice.</w:t>
             </w:r>
           </w:p>
         </w:tc>
@@ -5439,7 +5539,7 @@
         </w:tblPrEx>
         <w:tc>
           <w:tcPr>
-            <w:tcW w:w="3249" w:type="dxa"/>
+            <w:tcW w:w="2170" w:type="dxa"/>
           </w:tcPr>
           <w:p>
             <w:pPr>
@@ -5455,7 +5555,7 @@
         </w:tc>
         <w:tc>
           <w:tcPr>
-            <w:tcW w:w="5776" w:type="dxa"/>
+            <w:tcW w:w="3110" w:type="dxa"/>
           </w:tcPr>
           <w:p>
             <w:pPr>
@@ -5466,6 +5566,22 @@
                 <w:sz w:val="19"/>
               </w:rPr>
               <w:t>Wording of packing guides; template text when unavailable (timeout 20 s).</w:t>
+            </w:r>
+          </w:p>
+        </w:tc>
+        <w:tc>
+          <w:tcPr>
+            <w:tcW w:w="3745" w:type="dxa"/>
+          </w:tcPr>
+          <w:p>
+            <w:pPr>
+              <w:spacing w:before="0" w:after="0"/>
+            </w:pPr>
+            <w:r>
+              <w:rPr>
+                <w:sz w:val="19"/>
+              </w:rPr>
+              <w:t xml:space="preserve">Box code, name and inner dimensions, fill ratio, packing materials and the computed placement steps; no customer, recipient or order data.</w:t>
             </w:r>
           </w:p>
         </w:tc>
@@ -5489,7 +5605,7 @@
         </w:tblPrEx>
         <w:tc>
           <w:tcPr>
-            <w:tcW w:w="3249" w:type="dxa"/>
+            <w:tcW w:w="2170" w:type="dxa"/>
           </w:tcPr>
           <w:p>
             <w:pPr>
@@ -5505,7 +5621,7 @@
         </w:tc>
         <w:tc>
           <w:tcPr>
-            <w:tcW w:w="5776" w:type="dxa"/>
+            <w:tcW w:w="3110" w:type="dxa"/>
           </w:tcPr>
           <w:p>
             <w:pPr>
@@ -5516,6 +5632,22 @@
                 <w:sz w:val="19"/>
               </w:rPr>
               <w:t>Managed database.</w:t>
+            </w:r>
+          </w:p>
+        </w:tc>
+        <w:tc>
+          <w:tcPr>
+            <w:tcW w:w="3745" w:type="dxa"/>
+          </w:tcPr>
+          <w:p>
+            <w:pPr>
+              <w:spacing w:before="0" w:after="0"/>
+            </w:pPr>
+            <w:r>
+              <w:rPr>
+                <w:sz w:val="19"/>
+              </w:rPr>
+              <w:t xml:space="preserve">All application data over a TLS connection: staff accounts (hashed passwords), orders with recipient name, phone and address, stock, shipments, returns and the activity log.</w:t>
             </w:r>
           </w:p>
         </w:tc>
@@ -5539,7 +5671,7 @@
         </w:tblPrEx>
         <w:tc>
           <w:tcPr>
-            <w:tcW w:w="3249" w:type="dxa"/>
+            <w:tcW w:w="2170" w:type="dxa"/>
           </w:tcPr>
           <w:p>
             <w:pPr>
@@ -5555,7 +5687,7 @@
         </w:tc>
         <w:tc>
           <w:tcPr>
-            <w:tcW w:w="5776" w:type="dxa"/>
+            <w:tcW w:w="3110" w:type="dxa"/>
           </w:tcPr>
           <w:p>
             <w:pPr>
@@ -5566,6 +5698,22 @@
                 <w:sz w:val="19"/>
               </w:rPr>
               <w:t>Cache for authentication state.</w:t>
+            </w:r>
+          </w:p>
+        </w:tc>
+        <w:tc>
+          <w:tcPr>
+            <w:tcW w:w="3745" w:type="dxa"/>
+          </w:tcPr>
+          <w:p>
+            <w:pPr>
+              <w:spacing w:before="0" w:after="0"/>
+            </w:pPr>
+            <w:r>
+              <w:rPr>
+                <w:sz w:val="19"/>
+              </w:rPr>
+              <w:t xml:space="preserve">Per staff account (key user:auth:&lt;user id&gt;, with expiry): active flag, role and must-change-password state.</w:t>
             </w:r>
           </w:p>
         </w:tc>
@@ -6320,6 +6468,56 @@
                 <w:sz w:val="19"/>
               </w:rPr>
               <w:t>Not available yet: no hosted staging environment is declared. Planned: deploy the Docker Compose / Kubernetes setup to a hosted server and seed demo data with the repository scripts (see Design Brief risk R1). Production is not in scope.</w:t>
+            </w:r>
+          </w:p>
+        </w:tc>
+      </w:tr>
+      <w:tr>
+        <w:tblPrEx>
+          <w:tblBorders>
+            <w:top w:val="single" w:color="auto" w:sz="4" w:space="0"/>
+            <w:left w:val="single" w:color="auto" w:sz="4" w:space="0"/>
+            <w:bottom w:val="single" w:color="auto" w:sz="4" w:space="0"/>
+            <w:right w:val="single" w:color="auto" w:sz="4" w:space="0"/>
+            <w:insideH w:val="single" w:color="auto" w:sz="4" w:space="0"/>
+            <w:insideV w:val="single" w:color="auto" w:sz="4" w:space="0"/>
+          </w:tblBorders>
+          <w:tblCellMar>
+            <w:top w:w="0" w:type="dxa"/>
+            <w:left w:w="108" w:type="dxa"/>
+            <w:bottom w:w="0" w:type="dxa"/>
+            <w:right w:w="108" w:type="dxa"/>
+          </w:tblCellMar>
+        </w:tblPrEx>
+        <w:tc>
+          <w:tcPr>
+            <w:tcW w:w="2166" w:type="dxa"/>
+          </w:tcPr>
+          <w:p>
+            <w:pPr>
+              <w:spacing w:before="0" w:after="0"/>
+            </w:pPr>
+            <w:r>
+              <w:rPr>
+                <w:sz w:val="19"/>
+              </w:rPr>
+              <w:t xml:space="preserve">Deployment and rollback</w:t>
+            </w:r>
+          </w:p>
+        </w:tc>
+        <w:tc>
+          <w:tcPr>
+            <w:tcW w:w="6859" w:type="dxa"/>
+          </w:tcPr>
+          <w:p>
+            <w:pPr>
+              <w:spacing w:before="0" w:after="0"/>
+            </w:pPr>
+            <w:r>
+              <w:rPr>
+                <w:sz w:val="19"/>
+              </w:rPr>
+              <w:t xml:space="preserve">Deployment is manual: release.yml only builds and pushes the images to GitHub Container Registry, tagged with the branch name, the short commit SHA (sha-&lt;commit&gt;), the v* version and latest; the cluster is deployed with kubectl apply -k k8s/overlays/ghcr (or k8s/overlays/local). Rollback: kubectl -n optipackai rollout undo deployment/&lt;be | fe | storefront | packer&gt; returns to the previous ReplicaSet, or set newTag in k8s/overlays/ghcr/kustomization.yaml to an earlier sha-&lt;commit&gt; tag and apply again; with Docker Compose, check out the previous Git tag or commit and run docker compose up -d --build. Data on MongoDB Atlas is not rolled back automatically; data migration scripts in be/scripts are run manually.</w:t>
             </w:r>
           </w:p>
         </w:tc>

</xml_diff>